<commit_message>
fix(reports): show all assistance types in executive summary docx
The "By Assistance Type" table always rendered only the first row
(Medicine), because the template had a single static data row and the
backend fed it assistanceRows[0] regardless of the actual case mix.
Converted the table row into a docxtemplater loop over the full
assistanceRows array so every type with its real count/amount appears.

Co-Authored-By: Claude Sonnet 5 <noreply@anthropic.com>
</commit_message>
<xml_diff>
--- a/templates/reportsummarytemplate.docx
+++ b/templates/reportsummarytemplate.docx
@@ -484,7 +484,7 @@
                 <w:sz w:val="24"/>
                 <w:szCs w:val="24"/>
               </w:rPr>
-              <w:t>{type}</w:t>
+              <w:t>{#assistanceRows}{type}</w:t>
             </w:r>
           </w:p>
         </w:tc>
@@ -552,7 +552,7 @@
                 <w:sz w:val="24"/>
                 <w:szCs w:val="24"/>
               </w:rPr>
-              <w:t>{total}</w:t>
+              <w:t>{total}{/assistanceRows}</w:t>
             </w:r>
           </w:p>
         </w:tc>

</xml_diff>

<commit_message>
fix(reports): add missing For Approval and Released rows to status table
The "By Cases Status" table only tracked Intake, Encoding, For Review,
Recommending Approval, Approved, and Rejected, silently dropping cases
sitting in the for_approval or released statuses from the count.
Added both rows to the template in workflow order and wired their
counts through in reportDocxService.

Co-Authored-By: Claude Sonnet 5 <noreply@anthropic.com>
</commit_message>
<xml_diff>
--- a/templates/reportsummarytemplate.docx
+++ b/templates/reportsummarytemplate.docx
@@ -948,7 +948,7 @@
                 <w:sz w:val="24"/>
                 <w:szCs w:val="24"/>
               </w:rPr>
-              <w:t>Approved</w:t>
+              <w:t>For Approval</w:t>
             </w:r>
           </w:p>
         </w:tc>
@@ -982,7 +982,147 @@
                 <w:sz w:val="24"/>
                 <w:szCs w:val="24"/>
               </w:rPr>
+              <w:t>totalForApproval</w:t>
+            </w:r>
+            <w:proofErr w:type="spellEnd"/>
+            <w:r>
+              <w:rPr>
+                <w:b/>
+                <w:bCs/>
+                <w:sz w:val="24"/>
+                <w:szCs w:val="24"/>
+              </w:rPr>
+              <w:t>}</w:t>
+            </w:r>
+          </w:p>
+        </w:tc>
+      </w:tr>
+      <w:tr>
+        <w:tc>
+          <w:tcPr>
+            <w:tcW w:w="5170" w:type="dxa"/>
+          </w:tcPr>
+          <w:p>
+            <w:pPr>
+              <w:rPr>
+                <w:b/>
+                <w:bCs/>
+                <w:sz w:val="24"/>
+                <w:szCs w:val="24"/>
+              </w:rPr>
+            </w:pPr>
+            <w:r>
+              <w:rPr>
+                <w:b/>
+                <w:bCs/>
+                <w:sz w:val="24"/>
+                <w:szCs w:val="24"/>
+              </w:rPr>
+              <w:t>Approved</w:t>
+            </w:r>
+          </w:p>
+        </w:tc>
+        <w:tc>
+          <w:tcPr>
+            <w:tcW w:w="5170" w:type="dxa"/>
+          </w:tcPr>
+          <w:p>
+            <w:pPr>
+              <w:rPr>
+                <w:b/>
+                <w:bCs/>
+                <w:sz w:val="24"/>
+                <w:szCs w:val="24"/>
+              </w:rPr>
+            </w:pPr>
+            <w:r>
+              <w:rPr>
+                <w:b/>
+                <w:bCs/>
+                <w:sz w:val="24"/>
+                <w:szCs w:val="24"/>
+              </w:rPr>
+              <w:t>{</w:t>
+            </w:r>
+            <w:proofErr w:type="spellStart"/>
+            <w:r>
+              <w:rPr>
+                <w:b/>
+                <w:bCs/>
+                <w:sz w:val="24"/>
+                <w:szCs w:val="24"/>
+              </w:rPr>
               <w:t>totalApproved</w:t>
+            </w:r>
+            <w:proofErr w:type="spellEnd"/>
+            <w:r>
+              <w:rPr>
+                <w:b/>
+                <w:bCs/>
+                <w:sz w:val="24"/>
+                <w:szCs w:val="24"/>
+              </w:rPr>
+              <w:t>}</w:t>
+            </w:r>
+          </w:p>
+        </w:tc>
+      </w:tr>
+      <w:tr>
+        <w:tc>
+          <w:tcPr>
+            <w:tcW w:w="5170" w:type="dxa"/>
+          </w:tcPr>
+          <w:p>
+            <w:pPr>
+              <w:rPr>
+                <w:b/>
+                <w:bCs/>
+                <w:sz w:val="24"/>
+                <w:szCs w:val="24"/>
+              </w:rPr>
+            </w:pPr>
+            <w:r>
+              <w:rPr>
+                <w:b/>
+                <w:bCs/>
+                <w:sz w:val="24"/>
+                <w:szCs w:val="24"/>
+              </w:rPr>
+              <w:t>Released</w:t>
+            </w:r>
+          </w:p>
+        </w:tc>
+        <w:tc>
+          <w:tcPr>
+            <w:tcW w:w="5170" w:type="dxa"/>
+          </w:tcPr>
+          <w:p>
+            <w:pPr>
+              <w:rPr>
+                <w:b/>
+                <w:bCs/>
+                <w:sz w:val="24"/>
+                <w:szCs w:val="24"/>
+              </w:rPr>
+            </w:pPr>
+            <w:r>
+              <w:rPr>
+                <w:b/>
+                <w:bCs/>
+                <w:sz w:val="24"/>
+                <w:szCs w:val="24"/>
+              </w:rPr>
+              <w:t>{</w:t>
+            </w:r>
+            <w:proofErr w:type="spellStart"/>
+            <w:r>
+              <w:rPr>
+                <w:b/>
+                <w:bCs/>
+                <w:sz w:val="24"/>
+                <w:szCs w:val="24"/>
+              </w:rPr>
+              <w:t>totalReleased</w:t>
             </w:r>
             <w:proofErr w:type="spellEnd"/>
             <w:r>

</xml_diff>